<commit_message>
update1.2 (format dokumen, add dataset, add chitchat)
</commit_message>
<xml_diff>
--- a/documents/BIAYA.docx
+++ b/documents/BIAYA.docx
@@ -1,20 +1,12 @@
 
 <file path=word/document.xml><?xml version="1.0" encoding="utf-8"?>
-<w:document xmlns:wpc="http://schemas.microsoft.com/office/word/2010/wordprocessingCanvas" xmlns:mc="http://schemas.openxmlformats.org/markup-compatibility/2006" xmlns:o="urn:schemas-microsoft-com:office:office" xmlns:r="http://schemas.openxmlformats.org/officeDocument/2006/relationships" xmlns:m="http://schemas.openxmlformats.org/officeDocument/2006/math" xmlns:v="urn:schemas-microsoft-com:vml" xmlns:wp14="http://schemas.microsoft.com/office/word/2010/wordprocessingDrawing" xmlns:wp="http://schemas.openxmlformats.org/drawingml/2006/wordprocessingDrawing" xmlns:w10="urn:schemas-microsoft-com:office:word" xmlns:w="http://schemas.openxmlformats.org/wordprocessingml/2006/main" xmlns:w14="http://schemas.microsoft.com/office/word/2010/wordml" xmlns:w15="http://schemas.microsoft.com/office/word/2012/wordml" xmlns:w16se="http://schemas.microsoft.com/office/word/2015/wordml/symex" xmlns:w16cid="http://schemas.microsoft.com/office/word/2016/wordml/cid" xmlns:w16="http://schemas.microsoft.com/office/word/2018/wordml" xmlns:w16cex="http://schemas.microsoft.com/office/word/2018/wordml/cex" xmlns:w16sdtdh="http://schemas.microsoft.com/office/word/2020/wordml/sdtdatahash" xmlns:wne="http://schemas.microsoft.com/office/word/2006/wordml" xmlns:wpg="http://schemas.microsoft.com/office/word/2010/wordprocessingGroup" xmlns:wps="http://schemas.microsoft.com/office/word/2010/wordprocessingShape" mc:Ignorable="w14 w15 w16se w16cid w16 w16cex w16sdtdh wp14">
+<w:document xmlns:wpc="http://schemas.microsoft.com/office/word/2010/wordprocessingCanvas" xmlns:cx="http://schemas.microsoft.com/office/drawing/2014/chartex" xmlns:cx1="http://schemas.microsoft.com/office/drawing/2015/9/8/chartex" xmlns:cx2="http://schemas.microsoft.com/office/drawing/2015/10/21/chartex" xmlns:cx3="http://schemas.microsoft.com/office/drawing/2016/5/9/chartex" xmlns:cx4="http://schemas.microsoft.com/office/drawing/2016/5/10/chartex" xmlns:cx5="http://schemas.microsoft.com/office/drawing/2016/5/11/chartex" xmlns:cx6="http://schemas.microsoft.com/office/drawing/2016/5/12/chartex" xmlns:cx7="http://schemas.microsoft.com/office/drawing/2016/5/13/chartex" xmlns:cx8="http://schemas.microsoft.com/office/drawing/2016/5/14/chartex" xmlns:mc="http://schemas.openxmlformats.org/markup-compatibility/2006" xmlns:aink="http://schemas.microsoft.com/office/drawing/2016/ink" xmlns:am3d="http://schemas.microsoft.com/office/drawing/2017/model3d" xmlns:o="urn:schemas-microsoft-com:office:office" xmlns:r="http://schemas.openxmlformats.org/officeDocument/2006/relationships" xmlns:m="http://schemas.openxmlformats.org/officeDocument/2006/math" xmlns:v="urn:schemas-microsoft-com:vml" xmlns:wp14="http://schemas.microsoft.com/office/word/2010/wordprocessingDrawing" xmlns:wp="http://schemas.openxmlformats.org/drawingml/2006/wordprocessingDrawing" xmlns:w10="urn:schemas-microsoft-com:office:word" xmlns:w="http://schemas.openxmlformats.org/wordprocessingml/2006/main" xmlns:w14="http://schemas.microsoft.com/office/word/2010/wordml" xmlns:w15="http://schemas.microsoft.com/office/word/2012/wordml" xmlns:w16cex="http://schemas.microsoft.com/office/word/2018/wordml/cex" xmlns:w16cid="http://schemas.microsoft.com/office/word/2016/wordml/cid" xmlns:w16="http://schemas.microsoft.com/office/word/2018/wordml" xmlns:w16sdtdh="http://schemas.microsoft.com/office/word/2020/wordml/sdtdatahash" xmlns:w16se="http://schemas.microsoft.com/office/word/2015/wordml/symex" xmlns:wpg="http://schemas.microsoft.com/office/word/2010/wordprocessingGroup" xmlns:wpi="http://schemas.microsoft.com/office/word/2010/wordprocessingInk" xmlns:wne="http://schemas.microsoft.com/office/word/2006/wordml" xmlns:wps="http://schemas.microsoft.com/office/word/2010/wordprocessingShape" mc:Ignorable="w14 w15 w16se w16cid w16 w16cex w16sdtdh wp14">
   <w:body>
     <w:p>
       <w:pPr>
         <w:pStyle w:val="Heading1"/>
-        <w:jc w:val="center"/>
       </w:pPr>
       <w:r>
-        <w:rPr>
-          <w:rFonts w:ascii="Times New Roman" w:hAnsi="Times New Roman" w:eastAsia="Times New Roman" w:cs="Times New Roman"/>
-          <w:b/>
-          <w:bCs/>
-          <w:sz w:val="32"/>
-          <w:szCs w:val="32"/>
-        </w:rPr>
         <w:t>RINCIAN BIAYA KULIAH STT CIPASUNG</w:t>
       </w:r>
     </w:p>
@@ -22,25 +14,11 @@
       <w:tblPr>
         <w:tblStyle w:val="TableGrid"/>
         <w:tblW w:w="0" w:type="auto"/>
-        <w:tblBorders>
-          <w:top w:val="single" w:sz="4" w:space="0" w:color="auto"/>
-          <w:left w:val="single" w:sz="4" w:space="0" w:color="auto"/>
-          <w:bottom w:val="single" w:sz="4" w:space="0" w:color="auto"/>
-          <w:right w:val="single" w:sz="4" w:space="0" w:color="auto"/>
-          <w:insideH w:val="single" w:sz="4" w:space="0" w:color="auto"/>
-          <w:insideV w:val="single" w:sz="4" w:space="0" w:color="auto"/>
-        </w:tblBorders>
-        <w:tblCellMar>
-          <w:top w:w="0" w:type="dxa"/>
-          <w:left w:w="108" w:type="dxa"/>
-          <w:bottom w:w="0" w:type="dxa"/>
-          <w:right w:w="108" w:type="dxa"/>
-        </w:tblCellMar>
-        <w:tblLook w:firstRow="1" w:firstColumn="1" w:noVBand="1"/>
+        <w:tblLook w:val="07E0" w:firstRow="1" w:lastRow="1" w:firstColumn="1" w:lastColumn="1" w:noHBand="1" w:noVBand="1"/>
       </w:tblPr>
       <w:tblGrid>
-        <w:gridCol w:w="2518"/>
-        <w:gridCol w:w="7655"/>
+        <w:gridCol w:w="1951"/>
+        <w:gridCol w:w="8222"/>
         <w:gridCol w:w="1818"/>
       </w:tblGrid>
       <w:tr>
@@ -49,7 +27,7 @@
         </w:trPr>
         <w:tc>
           <w:tcPr>
-            <w:tcW w:w="2518" w:type="dxa"/>
+            <w:tcW w:w="1951" w:type="dxa"/>
             <w:tcBorders>
               <w:top w:val="single" w:sz="4" w:space="0" w:color="auto"/>
               <w:left w:val="single" w:sz="4" w:space="0" w:color="auto"/>
@@ -70,26 +48,26 @@
               <w:widowControl/>
               <w:jc w:val="center"/>
               <w:rPr>
-                <w:rFonts w:ascii="Times New Roman" w:hAnsi="Times New Roman" w:eastAsia="Times New Roman" w:cs="Times New Roman"/>
-                <w:sz w:val="24"/>
-                <w:szCs w:val="24"/>
-              </w:rPr>
-            </w:pPr>
-            <w:r>
-              <w:rPr>
-                <w:rFonts w:ascii="Times New Roman" w:hAnsi="Times New Roman" w:eastAsia="Times New Roman" w:cs="Times New Roman"/>
+                <w:rFonts w:ascii="Times New Roman" w:eastAsia="Times New Roman" w:hAnsi="Times New Roman" w:cs="Times New Roman"/>
+                <w:sz w:val="24"/>
+                <w:szCs w:val="24"/>
+              </w:rPr>
+            </w:pPr>
+            <w:r>
+              <w:rPr>
+                <w:rFonts w:ascii="Times New Roman" w:eastAsia="Times New Roman" w:hAnsi="Times New Roman" w:cs="Times New Roman"/>
                 <w:b/>
                 <w:bCs/>
                 <w:sz w:val="24"/>
                 <w:szCs w:val="24"/>
               </w:rPr>
-              <w:t>Komponen</w:t>
-            </w:r>
-          </w:p>
-        </w:tc>
-        <w:tc>
-          <w:tcPr>
-            <w:tcW w:w="7655" w:type="dxa"/>
+              <w:t>Biaya</w:t>
+            </w:r>
+          </w:p>
+        </w:tc>
+        <w:tc>
+          <w:tcPr>
+            <w:tcW w:w="8222" w:type="dxa"/>
             <w:tcBorders>
               <w:top w:val="single" w:sz="4" w:space="0" w:color="auto"/>
               <w:left w:val="single" w:sz="4" w:space="0" w:color="auto"/>
@@ -110,14 +88,14 @@
               <w:widowControl/>
               <w:jc w:val="center"/>
               <w:rPr>
-                <w:rFonts w:ascii="Times New Roman" w:hAnsi="Times New Roman" w:eastAsia="Times New Roman" w:cs="Times New Roman"/>
-                <w:sz w:val="24"/>
-                <w:szCs w:val="24"/>
-              </w:rPr>
-            </w:pPr>
-            <w:r>
-              <w:rPr>
-                <w:rFonts w:ascii="Times New Roman" w:hAnsi="Times New Roman" w:eastAsia="Times New Roman" w:cs="Times New Roman"/>
+                <w:rFonts w:ascii="Times New Roman" w:eastAsia="Times New Roman" w:hAnsi="Times New Roman" w:cs="Times New Roman"/>
+                <w:sz w:val="24"/>
+                <w:szCs w:val="24"/>
+              </w:rPr>
+            </w:pPr>
+            <w:r>
+              <w:rPr>
+                <w:rFonts w:ascii="Times New Roman" w:eastAsia="Times New Roman" w:hAnsi="Times New Roman" w:cs="Times New Roman"/>
                 <w:b/>
                 <w:bCs/>
                 <w:sz w:val="24"/>
@@ -150,14 +128,14 @@
               <w:widowControl/>
               <w:jc w:val="center"/>
               <w:rPr>
-                <w:rFonts w:ascii="Times New Roman" w:hAnsi="Times New Roman" w:eastAsia="Times New Roman" w:cs="Times New Roman"/>
-                <w:sz w:val="24"/>
-                <w:szCs w:val="24"/>
-              </w:rPr>
-            </w:pPr>
-            <w:r>
-              <w:rPr>
-                <w:rFonts w:ascii="Times New Roman" w:hAnsi="Times New Roman" w:eastAsia="Times New Roman" w:cs="Times New Roman"/>
+                <w:rFonts w:ascii="Times New Roman" w:eastAsia="Times New Roman" w:hAnsi="Times New Roman" w:cs="Times New Roman"/>
+                <w:sz w:val="24"/>
+                <w:szCs w:val="24"/>
+              </w:rPr>
+            </w:pPr>
+            <w:r>
+              <w:rPr>
+                <w:rFonts w:ascii="Times New Roman" w:eastAsia="Times New Roman" w:hAnsi="Times New Roman" w:cs="Times New Roman"/>
                 <w:b/>
                 <w:bCs/>
                 <w:sz w:val="24"/>
@@ -174,33 +152,34 @@
         </w:trPr>
         <w:tc>
           <w:tcPr>
-            <w:tcW w:w="2518" w:type="dxa"/>
-            <w:tcBorders>
-              <w:top w:val="single" w:sz="4" w:space="0" w:color="auto"/>
-              <w:left w:val="single" w:sz="4" w:space="0" w:color="auto"/>
-              <w:bottom w:val="single" w:sz="4" w:space="0" w:color="auto"/>
-              <w:right w:val="single" w:sz="4" w:space="0" w:color="auto"/>
-            </w:tcBorders>
-            <w:tcMar>
-              <w:top w:w="0" w:type="dxa"/>
-              <w:left w:w="108" w:type="dxa"/>
-              <w:bottom w:w="0" w:type="dxa"/>
-              <w:right w:w="108" w:type="dxa"/>
-            </w:tcMar>
-            <w:hideMark/>
-          </w:tcPr>
-          <w:p>
-            <w:pPr>
-              <w:widowControl/>
-              <w:rPr>
-                <w:rFonts w:ascii="Times New Roman" w:hAnsi="Times New Roman" w:eastAsia="Times New Roman" w:cs="Times New Roman"/>
-                <w:sz w:val="24"/>
-                <w:szCs w:val="24"/>
-              </w:rPr>
-            </w:pPr>
-            <w:r>
-              <w:rPr>
-                <w:rFonts w:ascii="Times New Roman" w:hAnsi="Times New Roman" w:eastAsia="Times New Roman" w:cs="Times New Roman"/>
+            <w:tcW w:w="1951" w:type="dxa"/>
+            <w:tcBorders>
+              <w:top w:val="single" w:sz="4" w:space="0" w:color="auto"/>
+              <w:left w:val="single" w:sz="4" w:space="0" w:color="auto"/>
+              <w:bottom w:val="single" w:sz="4" w:space="0" w:color="auto"/>
+              <w:right w:val="single" w:sz="4" w:space="0" w:color="auto"/>
+            </w:tcBorders>
+            <w:tcMar>
+              <w:top w:w="0" w:type="dxa"/>
+              <w:left w:w="108" w:type="dxa"/>
+              <w:bottom w:w="0" w:type="dxa"/>
+              <w:right w:w="108" w:type="dxa"/>
+            </w:tcMar>
+            <w:vAlign w:val="center"/>
+            <w:hideMark/>
+          </w:tcPr>
+          <w:p>
+            <w:pPr>
+              <w:widowControl/>
+              <w:rPr>
+                <w:rFonts w:ascii="Times New Roman" w:eastAsia="Times New Roman" w:hAnsi="Times New Roman" w:cs="Times New Roman"/>
+                <w:sz w:val="24"/>
+                <w:szCs w:val="24"/>
+              </w:rPr>
+            </w:pPr>
+            <w:r>
+              <w:rPr>
+                <w:rFonts w:ascii="Times New Roman" w:eastAsia="Times New Roman" w:hAnsi="Times New Roman" w:cs="Times New Roman"/>
                 <w:b/>
                 <w:bCs/>
                 <w:sz w:val="24"/>
@@ -212,37 +191,45 @@
         </w:tc>
         <w:tc>
           <w:tcPr>
-            <w:tcW w:w="7655" w:type="dxa"/>
-            <w:tcBorders>
-              <w:top w:val="single" w:sz="4" w:space="0" w:color="auto"/>
-              <w:left w:val="single" w:sz="4" w:space="0" w:color="auto"/>
-              <w:bottom w:val="single" w:sz="4" w:space="0" w:color="auto"/>
-              <w:right w:val="single" w:sz="4" w:space="0" w:color="auto"/>
-            </w:tcBorders>
-            <w:tcMar>
-              <w:top w:w="0" w:type="dxa"/>
-              <w:left w:w="108" w:type="dxa"/>
-              <w:bottom w:w="0" w:type="dxa"/>
-              <w:right w:w="108" w:type="dxa"/>
-            </w:tcMar>
-            <w:hideMark/>
-          </w:tcPr>
-          <w:p>
-            <w:pPr>
-              <w:widowControl/>
-              <w:rPr>
-                <w:rFonts w:ascii="Times New Roman" w:hAnsi="Times New Roman" w:eastAsia="Times New Roman" w:cs="Times New Roman"/>
-                <w:sz w:val="24"/>
-                <w:szCs w:val="24"/>
-              </w:rPr>
-            </w:pPr>
-            <w:r>
-              <w:rPr>
-                <w:rFonts w:ascii="Times New Roman" w:hAnsi="Times New Roman" w:eastAsia="Times New Roman" w:cs="Times New Roman"/>
-                <w:sz w:val="24"/>
-                <w:szCs w:val="24"/>
-              </w:rPr>
-              <w:t>Termasuk Biaya Pendaftaran, Jas Almamater, Kartu Tanda Mahasiswa, Orientasi Kampus, dan Uang Bangunan. Dibayarkan 1 kali di awal.</w:t>
+            <w:tcW w:w="8222" w:type="dxa"/>
+            <w:tcBorders>
+              <w:top w:val="single" w:sz="4" w:space="0" w:color="auto"/>
+              <w:left w:val="single" w:sz="4" w:space="0" w:color="auto"/>
+              <w:bottom w:val="single" w:sz="4" w:space="0" w:color="auto"/>
+              <w:right w:val="single" w:sz="4" w:space="0" w:color="auto"/>
+            </w:tcBorders>
+            <w:tcMar>
+              <w:top w:w="0" w:type="dxa"/>
+              <w:left w:w="108" w:type="dxa"/>
+              <w:bottom w:w="0" w:type="dxa"/>
+              <w:right w:w="108" w:type="dxa"/>
+            </w:tcMar>
+            <w:hideMark/>
+          </w:tcPr>
+          <w:p>
+            <w:pPr>
+              <w:widowControl/>
+              <w:rPr>
+                <w:rFonts w:ascii="Times New Roman" w:eastAsia="Times New Roman" w:hAnsi="Times New Roman" w:cs="Times New Roman"/>
+                <w:sz w:val="24"/>
+                <w:szCs w:val="24"/>
+              </w:rPr>
+            </w:pPr>
+            <w:r>
+              <w:rPr>
+                <w:rFonts w:ascii="Times New Roman" w:eastAsia="Times New Roman" w:hAnsi="Times New Roman" w:cs="Times New Roman"/>
+                <w:sz w:val="24"/>
+                <w:szCs w:val="24"/>
+              </w:rPr>
+              <w:t>Termasuk Biaya Pendaftaran (250.000)</w:t>
+            </w:r>
+            <w:r>
+              <w:rPr>
+                <w:rFonts w:ascii="Times New Roman" w:eastAsia="Times New Roman" w:hAnsi="Times New Roman" w:cs="Times New Roman"/>
+                <w:sz w:val="24"/>
+                <w:szCs w:val="24"/>
+              </w:rPr>
+              <w:t>, Jas Almamater, Kartu Tanda Mahasiswa, Orientasi Kampus, dan Uang Bangunan. Dibayarkan 1 kali di awal.</w:t>
             </w:r>
           </w:p>
         </w:tc>
@@ -269,14 +256,14 @@
               <w:widowControl/>
               <w:jc w:val="center"/>
               <w:rPr>
-                <w:rFonts w:ascii="Times New Roman" w:hAnsi="Times New Roman" w:eastAsia="Times New Roman" w:cs="Times New Roman"/>
-                <w:sz w:val="24"/>
-                <w:szCs w:val="24"/>
-              </w:rPr>
-            </w:pPr>
-            <w:r>
-              <w:rPr>
-                <w:rFonts w:ascii="Times New Roman" w:hAnsi="Times New Roman" w:eastAsia="Times New Roman" w:cs="Times New Roman"/>
+                <w:rFonts w:ascii="Times New Roman" w:eastAsia="Times New Roman" w:hAnsi="Times New Roman" w:cs="Times New Roman"/>
+                <w:sz w:val="24"/>
+                <w:szCs w:val="24"/>
+              </w:rPr>
+            </w:pPr>
+            <w:r>
+              <w:rPr>
+                <w:rFonts w:ascii="Times New Roman" w:eastAsia="Times New Roman" w:hAnsi="Times New Roman" w:cs="Times New Roman"/>
                 <w:sz w:val="24"/>
                 <w:szCs w:val="24"/>
               </w:rPr>
@@ -291,33 +278,34 @@
         </w:trPr>
         <w:tc>
           <w:tcPr>
-            <w:tcW w:w="2518" w:type="dxa"/>
-            <w:tcBorders>
-              <w:top w:val="single" w:sz="4" w:space="0" w:color="auto"/>
-              <w:left w:val="single" w:sz="4" w:space="0" w:color="auto"/>
-              <w:bottom w:val="single" w:sz="4" w:space="0" w:color="auto"/>
-              <w:right w:val="single" w:sz="4" w:space="0" w:color="auto"/>
-            </w:tcBorders>
-            <w:tcMar>
-              <w:top w:w="0" w:type="dxa"/>
-              <w:left w:w="108" w:type="dxa"/>
-              <w:bottom w:w="0" w:type="dxa"/>
-              <w:right w:w="108" w:type="dxa"/>
-            </w:tcMar>
-            <w:hideMark/>
-          </w:tcPr>
-          <w:p>
-            <w:pPr>
-              <w:widowControl/>
-              <w:rPr>
-                <w:rFonts w:ascii="Times New Roman" w:hAnsi="Times New Roman" w:eastAsia="Times New Roman" w:cs="Times New Roman"/>
-                <w:sz w:val="24"/>
-                <w:szCs w:val="24"/>
-              </w:rPr>
-            </w:pPr>
-            <w:r>
-              <w:rPr>
-                <w:rFonts w:ascii="Times New Roman" w:hAnsi="Times New Roman" w:eastAsia="Times New Roman" w:cs="Times New Roman"/>
+            <w:tcW w:w="1951" w:type="dxa"/>
+            <w:tcBorders>
+              <w:top w:val="single" w:sz="4" w:space="0" w:color="auto"/>
+              <w:left w:val="single" w:sz="4" w:space="0" w:color="auto"/>
+              <w:bottom w:val="single" w:sz="4" w:space="0" w:color="auto"/>
+              <w:right w:val="single" w:sz="4" w:space="0" w:color="auto"/>
+            </w:tcBorders>
+            <w:tcMar>
+              <w:top w:w="0" w:type="dxa"/>
+              <w:left w:w="108" w:type="dxa"/>
+              <w:bottom w:w="0" w:type="dxa"/>
+              <w:right w:w="108" w:type="dxa"/>
+            </w:tcMar>
+            <w:vAlign w:val="center"/>
+            <w:hideMark/>
+          </w:tcPr>
+          <w:p>
+            <w:pPr>
+              <w:widowControl/>
+              <w:rPr>
+                <w:rFonts w:ascii="Times New Roman" w:eastAsia="Times New Roman" w:hAnsi="Times New Roman" w:cs="Times New Roman"/>
+                <w:sz w:val="24"/>
+                <w:szCs w:val="24"/>
+              </w:rPr>
+            </w:pPr>
+            <w:r>
+              <w:rPr>
+                <w:rFonts w:ascii="Times New Roman" w:eastAsia="Times New Roman" w:hAnsi="Times New Roman" w:cs="Times New Roman"/>
                 <w:b/>
                 <w:bCs/>
                 <w:sz w:val="24"/>
@@ -329,37 +317,45 @@
         </w:tc>
         <w:tc>
           <w:tcPr>
-            <w:tcW w:w="7655" w:type="dxa"/>
-            <w:tcBorders>
-              <w:top w:val="single" w:sz="4" w:space="0" w:color="auto"/>
-              <w:left w:val="single" w:sz="4" w:space="0" w:color="auto"/>
-              <w:bottom w:val="single" w:sz="4" w:space="0" w:color="auto"/>
-              <w:right w:val="single" w:sz="4" w:space="0" w:color="auto"/>
-            </w:tcBorders>
-            <w:tcMar>
-              <w:top w:w="0" w:type="dxa"/>
-              <w:left w:w="108" w:type="dxa"/>
-              <w:bottom w:w="0" w:type="dxa"/>
-              <w:right w:w="108" w:type="dxa"/>
-            </w:tcMar>
-            <w:hideMark/>
-          </w:tcPr>
-          <w:p>
-            <w:pPr>
-              <w:widowControl/>
-              <w:rPr>
-                <w:rFonts w:ascii="Times New Roman" w:hAnsi="Times New Roman" w:eastAsia="Times New Roman" w:cs="Times New Roman"/>
-                <w:sz w:val="24"/>
-                <w:szCs w:val="24"/>
-              </w:rPr>
-            </w:pPr>
-            <w:r>
-              <w:rPr>
-                <w:rFonts w:ascii="Times New Roman" w:hAnsi="Times New Roman" w:eastAsia="Times New Roman" w:cs="Times New Roman"/>
-                <w:sz w:val="24"/>
-                <w:szCs w:val="24"/>
-              </w:rPr>
-              <w:t>Uang Kuliah Tunggal yang dibayarkan setiap semester (6 bulan). Bisa dicicil per bulan.</w:t>
+            <w:tcW w:w="8222" w:type="dxa"/>
+            <w:tcBorders>
+              <w:top w:val="single" w:sz="4" w:space="0" w:color="auto"/>
+              <w:left w:val="single" w:sz="4" w:space="0" w:color="auto"/>
+              <w:bottom w:val="single" w:sz="4" w:space="0" w:color="auto"/>
+              <w:right w:val="single" w:sz="4" w:space="0" w:color="auto"/>
+            </w:tcBorders>
+            <w:tcMar>
+              <w:top w:w="0" w:type="dxa"/>
+              <w:left w:w="108" w:type="dxa"/>
+              <w:bottom w:w="0" w:type="dxa"/>
+              <w:right w:w="108" w:type="dxa"/>
+            </w:tcMar>
+            <w:hideMark/>
+          </w:tcPr>
+          <w:p>
+            <w:pPr>
+              <w:widowControl/>
+              <w:rPr>
+                <w:rFonts w:ascii="Times New Roman" w:eastAsia="Times New Roman" w:hAnsi="Times New Roman" w:cs="Times New Roman"/>
+                <w:sz w:val="24"/>
+                <w:szCs w:val="24"/>
+              </w:rPr>
+            </w:pPr>
+            <w:r>
+              <w:rPr>
+                <w:rFonts w:ascii="Times New Roman" w:eastAsia="Times New Roman" w:hAnsi="Times New Roman" w:cs="Times New Roman"/>
+                <w:sz w:val="24"/>
+                <w:szCs w:val="24"/>
+              </w:rPr>
+              <w:t xml:space="preserve">Uang Kuliah Tunggal </w:t>
+            </w:r>
+            <w:r>
+              <w:rPr>
+                <w:rFonts w:ascii="Times New Roman" w:eastAsia="Times New Roman" w:hAnsi="Times New Roman" w:cs="Times New Roman"/>
+                <w:sz w:val="24"/>
+                <w:szCs w:val="24"/>
+              </w:rPr>
+              <w:t>yang dibayarkan setiap semester (6 bulan). Bisa dicicil per bulan.</w:t>
             </w:r>
           </w:p>
         </w:tc>
@@ -386,14 +382,14 @@
               <w:widowControl/>
               <w:jc w:val="center"/>
               <w:rPr>
-                <w:rFonts w:ascii="Times New Roman" w:hAnsi="Times New Roman" w:eastAsia="Times New Roman" w:cs="Times New Roman"/>
-                <w:sz w:val="24"/>
-                <w:szCs w:val="24"/>
-              </w:rPr>
-            </w:pPr>
-            <w:r>
-              <w:rPr>
-                <w:rFonts w:ascii="Times New Roman" w:hAnsi="Times New Roman" w:eastAsia="Times New Roman" w:cs="Times New Roman"/>
+                <w:rFonts w:ascii="Times New Roman" w:eastAsia="Times New Roman" w:hAnsi="Times New Roman" w:cs="Times New Roman"/>
+                <w:sz w:val="24"/>
+                <w:szCs w:val="24"/>
+              </w:rPr>
+            </w:pPr>
+            <w:r>
+              <w:rPr>
+                <w:rFonts w:ascii="Times New Roman" w:eastAsia="Times New Roman" w:hAnsi="Times New Roman" w:cs="Times New Roman"/>
                 <w:sz w:val="24"/>
                 <w:szCs w:val="24"/>
               </w:rPr>
@@ -408,33 +404,34 @@
         </w:trPr>
         <w:tc>
           <w:tcPr>
-            <w:tcW w:w="2518" w:type="dxa"/>
-            <w:tcBorders>
-              <w:top w:val="single" w:sz="4" w:space="0" w:color="auto"/>
-              <w:left w:val="single" w:sz="4" w:space="0" w:color="auto"/>
-              <w:bottom w:val="single" w:sz="4" w:space="0" w:color="auto"/>
-              <w:right w:val="single" w:sz="4" w:space="0" w:color="auto"/>
-            </w:tcBorders>
-            <w:tcMar>
-              <w:top w:w="0" w:type="dxa"/>
-              <w:left w:w="108" w:type="dxa"/>
-              <w:bottom w:w="0" w:type="dxa"/>
-              <w:right w:w="108" w:type="dxa"/>
-            </w:tcMar>
-            <w:hideMark/>
-          </w:tcPr>
-          <w:p>
-            <w:pPr>
-              <w:widowControl/>
-              <w:rPr>
-                <w:rFonts w:ascii="Times New Roman" w:hAnsi="Times New Roman" w:eastAsia="Times New Roman" w:cs="Times New Roman"/>
-                <w:sz w:val="24"/>
-                <w:szCs w:val="24"/>
-              </w:rPr>
-            </w:pPr>
-            <w:r>
-              <w:rPr>
-                <w:rFonts w:ascii="Times New Roman" w:hAnsi="Times New Roman" w:eastAsia="Times New Roman" w:cs="Times New Roman"/>
+            <w:tcW w:w="1951" w:type="dxa"/>
+            <w:tcBorders>
+              <w:top w:val="single" w:sz="4" w:space="0" w:color="auto"/>
+              <w:left w:val="single" w:sz="4" w:space="0" w:color="auto"/>
+              <w:bottom w:val="single" w:sz="4" w:space="0" w:color="auto"/>
+              <w:right w:val="single" w:sz="4" w:space="0" w:color="auto"/>
+            </w:tcBorders>
+            <w:tcMar>
+              <w:top w:w="0" w:type="dxa"/>
+              <w:left w:w="108" w:type="dxa"/>
+              <w:bottom w:w="0" w:type="dxa"/>
+              <w:right w:w="108" w:type="dxa"/>
+            </w:tcMar>
+            <w:vAlign w:val="center"/>
+            <w:hideMark/>
+          </w:tcPr>
+          <w:p>
+            <w:pPr>
+              <w:widowControl/>
+              <w:rPr>
+                <w:rFonts w:ascii="Times New Roman" w:eastAsia="Times New Roman" w:hAnsi="Times New Roman" w:cs="Times New Roman"/>
+                <w:sz w:val="24"/>
+                <w:szCs w:val="24"/>
+              </w:rPr>
+            </w:pPr>
+            <w:r>
+              <w:rPr>
+                <w:rFonts w:ascii="Times New Roman" w:eastAsia="Times New Roman" w:hAnsi="Times New Roman" w:cs="Times New Roman"/>
                 <w:b/>
                 <w:bCs/>
                 <w:sz w:val="24"/>
@@ -446,37 +443,45 @@
         </w:tc>
         <w:tc>
           <w:tcPr>
-            <w:tcW w:w="7655" w:type="dxa"/>
-            <w:tcBorders>
-              <w:top w:val="single" w:sz="4" w:space="0" w:color="auto"/>
-              <w:left w:val="single" w:sz="4" w:space="0" w:color="auto"/>
-              <w:bottom w:val="single" w:sz="4" w:space="0" w:color="auto"/>
-              <w:right w:val="single" w:sz="4" w:space="0" w:color="auto"/>
-            </w:tcBorders>
-            <w:tcMar>
-              <w:top w:w="0" w:type="dxa"/>
-              <w:left w:w="108" w:type="dxa"/>
-              <w:bottom w:w="0" w:type="dxa"/>
-              <w:right w:w="108" w:type="dxa"/>
-            </w:tcMar>
-            <w:hideMark/>
-          </w:tcPr>
-          <w:p>
-            <w:pPr>
-              <w:widowControl/>
-              <w:rPr>
-                <w:rFonts w:ascii="Times New Roman" w:hAnsi="Times New Roman" w:eastAsia="Times New Roman" w:cs="Times New Roman"/>
-                <w:sz w:val="24"/>
-                <w:szCs w:val="24"/>
-              </w:rPr>
-            </w:pPr>
-            <w:r>
-              <w:rPr>
-                <w:rFonts w:ascii="Times New Roman" w:hAnsi="Times New Roman" w:eastAsia="Times New Roman" w:cs="Times New Roman"/>
-                <w:sz w:val="24"/>
-                <w:szCs w:val="24"/>
-              </w:rPr>
-              <w:t>Total Biaya di Semester I (Gabungan Biaya Awal + UKT).</w:t>
+            <w:tcW w:w="8222" w:type="dxa"/>
+            <w:tcBorders>
+              <w:top w:val="single" w:sz="4" w:space="0" w:color="auto"/>
+              <w:left w:val="single" w:sz="4" w:space="0" w:color="auto"/>
+              <w:bottom w:val="single" w:sz="4" w:space="0" w:color="auto"/>
+              <w:right w:val="single" w:sz="4" w:space="0" w:color="auto"/>
+            </w:tcBorders>
+            <w:tcMar>
+              <w:top w:w="0" w:type="dxa"/>
+              <w:left w:w="108" w:type="dxa"/>
+              <w:bottom w:w="0" w:type="dxa"/>
+              <w:right w:w="108" w:type="dxa"/>
+            </w:tcMar>
+            <w:hideMark/>
+          </w:tcPr>
+          <w:p>
+            <w:pPr>
+              <w:widowControl/>
+              <w:rPr>
+                <w:rFonts w:ascii="Times New Roman" w:eastAsia="Times New Roman" w:hAnsi="Times New Roman" w:cs="Times New Roman"/>
+                <w:sz w:val="24"/>
+                <w:szCs w:val="24"/>
+              </w:rPr>
+            </w:pPr>
+            <w:r>
+              <w:rPr>
+                <w:rFonts w:ascii="Times New Roman" w:eastAsia="Times New Roman" w:hAnsi="Times New Roman" w:cs="Times New Roman"/>
+                <w:sz w:val="24"/>
+                <w:szCs w:val="24"/>
+              </w:rPr>
+              <w:t>Gabungan Biaya Awal + UKT</w:t>
+            </w:r>
+            <w:r>
+              <w:rPr>
+                <w:rFonts w:ascii="Times New Roman" w:eastAsia="Times New Roman" w:hAnsi="Times New Roman" w:cs="Times New Roman"/>
+                <w:sz w:val="24"/>
+                <w:szCs w:val="24"/>
+              </w:rPr>
+              <w:t>.</w:t>
             </w:r>
           </w:p>
         </w:tc>
@@ -503,14 +508,14 @@
               <w:widowControl/>
               <w:jc w:val="center"/>
               <w:rPr>
-                <w:rFonts w:ascii="Times New Roman" w:hAnsi="Times New Roman" w:eastAsia="Times New Roman" w:cs="Times New Roman"/>
-                <w:sz w:val="24"/>
-                <w:szCs w:val="24"/>
-              </w:rPr>
-            </w:pPr>
-            <w:r>
-              <w:rPr>
-                <w:rFonts w:ascii="Times New Roman" w:hAnsi="Times New Roman" w:eastAsia="Times New Roman" w:cs="Times New Roman"/>
+                <w:rFonts w:ascii="Times New Roman" w:eastAsia="Times New Roman" w:hAnsi="Times New Roman" w:cs="Times New Roman"/>
+                <w:sz w:val="24"/>
+                <w:szCs w:val="24"/>
+              </w:rPr>
+            </w:pPr>
+            <w:r>
+              <w:rPr>
+                <w:rFonts w:ascii="Times New Roman" w:eastAsia="Times New Roman" w:hAnsi="Times New Roman" w:cs="Times New Roman"/>
                 <w:sz w:val="24"/>
                 <w:szCs w:val="24"/>
               </w:rPr>
@@ -525,33 +530,34 @@
         </w:trPr>
         <w:tc>
           <w:tcPr>
-            <w:tcW w:w="2518" w:type="dxa"/>
-            <w:tcBorders>
-              <w:top w:val="single" w:sz="4" w:space="0" w:color="auto"/>
-              <w:left w:val="single" w:sz="4" w:space="0" w:color="auto"/>
-              <w:bottom w:val="single" w:sz="4" w:space="0" w:color="auto"/>
-              <w:right w:val="single" w:sz="4" w:space="0" w:color="auto"/>
-            </w:tcBorders>
-            <w:tcMar>
-              <w:top w:w="0" w:type="dxa"/>
-              <w:left w:w="108" w:type="dxa"/>
-              <w:bottom w:w="0" w:type="dxa"/>
-              <w:right w:w="108" w:type="dxa"/>
-            </w:tcMar>
-            <w:hideMark/>
-          </w:tcPr>
-          <w:p>
-            <w:pPr>
-              <w:widowControl/>
-              <w:rPr>
-                <w:rFonts w:ascii="Times New Roman" w:hAnsi="Times New Roman" w:eastAsia="Times New Roman" w:cs="Times New Roman"/>
-                <w:sz w:val="24"/>
-                <w:szCs w:val="24"/>
-              </w:rPr>
-            </w:pPr>
-            <w:r>
-              <w:rPr>
-                <w:rFonts w:ascii="Times New Roman" w:hAnsi="Times New Roman" w:eastAsia="Times New Roman" w:cs="Times New Roman"/>
+            <w:tcW w:w="1951" w:type="dxa"/>
+            <w:tcBorders>
+              <w:top w:val="single" w:sz="4" w:space="0" w:color="auto"/>
+              <w:left w:val="single" w:sz="4" w:space="0" w:color="auto"/>
+              <w:bottom w:val="single" w:sz="4" w:space="0" w:color="auto"/>
+              <w:right w:val="single" w:sz="4" w:space="0" w:color="auto"/>
+            </w:tcBorders>
+            <w:tcMar>
+              <w:top w:w="0" w:type="dxa"/>
+              <w:left w:w="108" w:type="dxa"/>
+              <w:bottom w:w="0" w:type="dxa"/>
+              <w:right w:w="108" w:type="dxa"/>
+            </w:tcMar>
+            <w:vAlign w:val="center"/>
+            <w:hideMark/>
+          </w:tcPr>
+          <w:p>
+            <w:pPr>
+              <w:widowControl/>
+              <w:rPr>
+                <w:rFonts w:ascii="Times New Roman" w:eastAsia="Times New Roman" w:hAnsi="Times New Roman" w:cs="Times New Roman"/>
+                <w:sz w:val="24"/>
+                <w:szCs w:val="24"/>
+              </w:rPr>
+            </w:pPr>
+            <w:r>
+              <w:rPr>
+                <w:rFonts w:ascii="Times New Roman" w:eastAsia="Times New Roman" w:hAnsi="Times New Roman" w:cs="Times New Roman"/>
                 <w:b/>
                 <w:bCs/>
                 <w:sz w:val="24"/>
@@ -563,38 +569,29 @@
         </w:tc>
         <w:tc>
           <w:tcPr>
-            <w:tcW w:w="7655" w:type="dxa"/>
-            <w:tcBorders>
-              <w:top w:val="single" w:sz="4" w:space="0" w:color="auto"/>
-              <w:left w:val="single" w:sz="4" w:space="0" w:color="auto"/>
-              <w:bottom w:val="single" w:sz="4" w:space="0" w:color="auto"/>
-              <w:right w:val="single" w:sz="4" w:space="0" w:color="auto"/>
-            </w:tcBorders>
-            <w:tcMar>
-              <w:top w:w="0" w:type="dxa"/>
-              <w:left w:w="108" w:type="dxa"/>
-              <w:bottom w:w="0" w:type="dxa"/>
-              <w:right w:w="108" w:type="dxa"/>
-            </w:tcMar>
-            <w:hideMark/>
-          </w:tcPr>
-          <w:p>
-            <w:pPr>
-              <w:widowControl/>
-              <w:rPr>
-                <w:rFonts w:ascii="Times New Roman" w:hAnsi="Times New Roman" w:eastAsia="Times New Roman" w:cs="Times New Roman"/>
-                <w:sz w:val="24"/>
-                <w:szCs w:val="24"/>
-              </w:rPr>
-            </w:pPr>
-            <w:r>
-              <w:rPr>
-                <w:rFonts w:ascii="Times New Roman" w:hAnsi="Times New Roman" w:eastAsia="Times New Roman" w:cs="Times New Roman"/>
-                <w:sz w:val="24"/>
-                <w:szCs w:val="24"/>
-              </w:rPr>
-              <w:t>Biaya di Semester II.</w:t>
-            </w:r>
+            <w:tcW w:w="8222" w:type="dxa"/>
+            <w:tcBorders>
+              <w:top w:val="single" w:sz="4" w:space="0" w:color="auto"/>
+              <w:left w:val="single" w:sz="4" w:space="0" w:color="auto"/>
+              <w:bottom w:val="single" w:sz="4" w:space="0" w:color="auto"/>
+              <w:right w:val="single" w:sz="4" w:space="0" w:color="auto"/>
+            </w:tcBorders>
+            <w:tcMar>
+              <w:top w:w="0" w:type="dxa"/>
+              <w:left w:w="108" w:type="dxa"/>
+              <w:bottom w:w="0" w:type="dxa"/>
+              <w:right w:w="108" w:type="dxa"/>
+            </w:tcMar>
+          </w:tcPr>
+          <w:p>
+            <w:pPr>
+              <w:widowControl/>
+              <w:rPr>
+                <w:rFonts w:ascii="Times New Roman" w:eastAsia="Times New Roman" w:hAnsi="Times New Roman" w:cs="Times New Roman"/>
+                <w:sz w:val="24"/>
+                <w:szCs w:val="24"/>
+              </w:rPr>
+            </w:pPr>
           </w:p>
         </w:tc>
         <w:tc>
@@ -620,14 +617,14 @@
               <w:widowControl/>
               <w:jc w:val="center"/>
               <w:rPr>
-                <w:rFonts w:ascii="Times New Roman" w:hAnsi="Times New Roman" w:eastAsia="Times New Roman" w:cs="Times New Roman"/>
-                <w:sz w:val="24"/>
-                <w:szCs w:val="24"/>
-              </w:rPr>
-            </w:pPr>
-            <w:r>
-              <w:rPr>
-                <w:rFonts w:ascii="Times New Roman" w:hAnsi="Times New Roman" w:eastAsia="Times New Roman" w:cs="Times New Roman"/>
+                <w:rFonts w:ascii="Times New Roman" w:eastAsia="Times New Roman" w:hAnsi="Times New Roman" w:cs="Times New Roman"/>
+                <w:sz w:val="24"/>
+                <w:szCs w:val="24"/>
+              </w:rPr>
+            </w:pPr>
+            <w:r>
+              <w:rPr>
+                <w:rFonts w:ascii="Times New Roman" w:eastAsia="Times New Roman" w:hAnsi="Times New Roman" w:cs="Times New Roman"/>
                 <w:sz w:val="24"/>
                 <w:szCs w:val="24"/>
               </w:rPr>
@@ -642,33 +639,34 @@
         </w:trPr>
         <w:tc>
           <w:tcPr>
-            <w:tcW w:w="2518" w:type="dxa"/>
-            <w:tcBorders>
-              <w:top w:val="single" w:sz="4" w:space="0" w:color="auto"/>
-              <w:left w:val="single" w:sz="4" w:space="0" w:color="auto"/>
-              <w:bottom w:val="single" w:sz="4" w:space="0" w:color="auto"/>
-              <w:right w:val="single" w:sz="4" w:space="0" w:color="auto"/>
-            </w:tcBorders>
-            <w:tcMar>
-              <w:top w:w="0" w:type="dxa"/>
-              <w:left w:w="108" w:type="dxa"/>
-              <w:bottom w:w="0" w:type="dxa"/>
-              <w:right w:w="108" w:type="dxa"/>
-            </w:tcMar>
-            <w:hideMark/>
-          </w:tcPr>
-          <w:p>
-            <w:pPr>
-              <w:widowControl/>
-              <w:rPr>
-                <w:rFonts w:ascii="Times New Roman" w:hAnsi="Times New Roman" w:eastAsia="Times New Roman" w:cs="Times New Roman"/>
-                <w:sz w:val="24"/>
-                <w:szCs w:val="24"/>
-              </w:rPr>
-            </w:pPr>
-            <w:r>
-              <w:rPr>
-                <w:rFonts w:ascii="Times New Roman" w:hAnsi="Times New Roman" w:eastAsia="Times New Roman" w:cs="Times New Roman"/>
+            <w:tcW w:w="1951" w:type="dxa"/>
+            <w:tcBorders>
+              <w:top w:val="single" w:sz="4" w:space="0" w:color="auto"/>
+              <w:left w:val="single" w:sz="4" w:space="0" w:color="auto"/>
+              <w:bottom w:val="single" w:sz="4" w:space="0" w:color="auto"/>
+              <w:right w:val="single" w:sz="4" w:space="0" w:color="auto"/>
+            </w:tcBorders>
+            <w:tcMar>
+              <w:top w:w="0" w:type="dxa"/>
+              <w:left w:w="108" w:type="dxa"/>
+              <w:bottom w:w="0" w:type="dxa"/>
+              <w:right w:w="108" w:type="dxa"/>
+            </w:tcMar>
+            <w:vAlign w:val="center"/>
+            <w:hideMark/>
+          </w:tcPr>
+          <w:p>
+            <w:pPr>
+              <w:widowControl/>
+              <w:rPr>
+                <w:rFonts w:ascii="Times New Roman" w:eastAsia="Times New Roman" w:hAnsi="Times New Roman" w:cs="Times New Roman"/>
+                <w:sz w:val="24"/>
+                <w:szCs w:val="24"/>
+              </w:rPr>
+            </w:pPr>
+            <w:r>
+              <w:rPr>
+                <w:rFonts w:ascii="Times New Roman" w:eastAsia="Times New Roman" w:hAnsi="Times New Roman" w:cs="Times New Roman"/>
                 <w:b/>
                 <w:bCs/>
                 <w:sz w:val="24"/>
@@ -680,38 +678,29 @@
         </w:tc>
         <w:tc>
           <w:tcPr>
-            <w:tcW w:w="7655" w:type="dxa"/>
-            <w:tcBorders>
-              <w:top w:val="single" w:sz="4" w:space="0" w:color="auto"/>
-              <w:left w:val="single" w:sz="4" w:space="0" w:color="auto"/>
-              <w:bottom w:val="single" w:sz="4" w:space="0" w:color="auto"/>
-              <w:right w:val="single" w:sz="4" w:space="0" w:color="auto"/>
-            </w:tcBorders>
-            <w:tcMar>
-              <w:top w:w="0" w:type="dxa"/>
-              <w:left w:w="108" w:type="dxa"/>
-              <w:bottom w:w="0" w:type="dxa"/>
-              <w:right w:w="108" w:type="dxa"/>
-            </w:tcMar>
-            <w:hideMark/>
-          </w:tcPr>
-          <w:p>
-            <w:pPr>
-              <w:widowControl/>
-              <w:rPr>
-                <w:rFonts w:ascii="Times New Roman" w:hAnsi="Times New Roman" w:eastAsia="Times New Roman" w:cs="Times New Roman"/>
-                <w:sz w:val="24"/>
-                <w:szCs w:val="24"/>
-              </w:rPr>
-            </w:pPr>
-            <w:r>
-              <w:rPr>
-                <w:rFonts w:ascii="Times New Roman" w:hAnsi="Times New Roman" w:eastAsia="Times New Roman" w:cs="Times New Roman"/>
-                <w:sz w:val="24"/>
-                <w:szCs w:val="24"/>
-              </w:rPr>
-              <w:t>Biaya di Semester III.</w:t>
-            </w:r>
+            <w:tcW w:w="8222" w:type="dxa"/>
+            <w:tcBorders>
+              <w:top w:val="single" w:sz="4" w:space="0" w:color="auto"/>
+              <w:left w:val="single" w:sz="4" w:space="0" w:color="auto"/>
+              <w:bottom w:val="single" w:sz="4" w:space="0" w:color="auto"/>
+              <w:right w:val="single" w:sz="4" w:space="0" w:color="auto"/>
+            </w:tcBorders>
+            <w:tcMar>
+              <w:top w:w="0" w:type="dxa"/>
+              <w:left w:w="108" w:type="dxa"/>
+              <w:bottom w:w="0" w:type="dxa"/>
+              <w:right w:w="108" w:type="dxa"/>
+            </w:tcMar>
+          </w:tcPr>
+          <w:p>
+            <w:pPr>
+              <w:widowControl/>
+              <w:rPr>
+                <w:rFonts w:ascii="Times New Roman" w:eastAsia="Times New Roman" w:hAnsi="Times New Roman" w:cs="Times New Roman"/>
+                <w:sz w:val="24"/>
+                <w:szCs w:val="24"/>
+              </w:rPr>
+            </w:pPr>
           </w:p>
         </w:tc>
         <w:tc>
@@ -737,14 +726,14 @@
               <w:widowControl/>
               <w:jc w:val="center"/>
               <w:rPr>
-                <w:rFonts w:ascii="Times New Roman" w:hAnsi="Times New Roman" w:eastAsia="Times New Roman" w:cs="Times New Roman"/>
-                <w:sz w:val="24"/>
-                <w:szCs w:val="24"/>
-              </w:rPr>
-            </w:pPr>
-            <w:r>
-              <w:rPr>
-                <w:rFonts w:ascii="Times New Roman" w:hAnsi="Times New Roman" w:eastAsia="Times New Roman" w:cs="Times New Roman"/>
+                <w:rFonts w:ascii="Times New Roman" w:eastAsia="Times New Roman" w:hAnsi="Times New Roman" w:cs="Times New Roman"/>
+                <w:sz w:val="24"/>
+                <w:szCs w:val="24"/>
+              </w:rPr>
+            </w:pPr>
+            <w:r>
+              <w:rPr>
+                <w:rFonts w:ascii="Times New Roman" w:eastAsia="Times New Roman" w:hAnsi="Times New Roman" w:cs="Times New Roman"/>
                 <w:sz w:val="24"/>
                 <w:szCs w:val="24"/>
               </w:rPr>
@@ -759,76 +748,78 @@
         </w:trPr>
         <w:tc>
           <w:tcPr>
-            <w:tcW w:w="2518" w:type="dxa"/>
-            <w:tcBorders>
-              <w:top w:val="single" w:sz="4" w:space="0" w:color="auto"/>
-              <w:left w:val="single" w:sz="4" w:space="0" w:color="auto"/>
-              <w:bottom w:val="single" w:sz="4" w:space="0" w:color="auto"/>
-              <w:right w:val="single" w:sz="4" w:space="0" w:color="auto"/>
-            </w:tcBorders>
-            <w:tcMar>
-              <w:top w:w="0" w:type="dxa"/>
-              <w:left w:w="108" w:type="dxa"/>
-              <w:bottom w:w="0" w:type="dxa"/>
-              <w:right w:w="108" w:type="dxa"/>
-            </w:tcMar>
-            <w:hideMark/>
-          </w:tcPr>
-          <w:p>
-            <w:pPr>
-              <w:widowControl/>
-              <w:rPr>
-                <w:rFonts w:ascii="Times New Roman" w:hAnsi="Times New Roman" w:eastAsia="Times New Roman" w:cs="Times New Roman"/>
-                <w:sz w:val="24"/>
-                <w:szCs w:val="24"/>
-              </w:rPr>
-            </w:pPr>
-            <w:r>
-              <w:rPr>
-                <w:rFonts w:ascii="Times New Roman" w:hAnsi="Times New Roman" w:eastAsia="Times New Roman" w:cs="Times New Roman"/>
+            <w:tcW w:w="1951" w:type="dxa"/>
+            <w:tcBorders>
+              <w:top w:val="single" w:sz="4" w:space="0" w:color="auto"/>
+              <w:left w:val="single" w:sz="4" w:space="0" w:color="auto"/>
+              <w:bottom w:val="single" w:sz="4" w:space="0" w:color="auto"/>
+              <w:right w:val="single" w:sz="4" w:space="0" w:color="auto"/>
+            </w:tcBorders>
+            <w:tcMar>
+              <w:top w:w="0" w:type="dxa"/>
+              <w:left w:w="108" w:type="dxa"/>
+              <w:bottom w:w="0" w:type="dxa"/>
+              <w:right w:w="108" w:type="dxa"/>
+            </w:tcMar>
+            <w:vAlign w:val="center"/>
+            <w:hideMark/>
+          </w:tcPr>
+          <w:p>
+            <w:pPr>
+              <w:widowControl/>
+              <w:rPr>
+                <w:rFonts w:ascii="Times New Roman" w:eastAsia="Times New Roman" w:hAnsi="Times New Roman" w:cs="Times New Roman"/>
+                <w:sz w:val="24"/>
+                <w:szCs w:val="24"/>
+              </w:rPr>
+            </w:pPr>
+            <w:r>
+              <w:rPr>
+                <w:rFonts w:ascii="Times New Roman" w:eastAsia="Times New Roman" w:hAnsi="Times New Roman" w:cs="Times New Roman"/>
                 <w:b/>
                 <w:bCs/>
                 <w:sz w:val="24"/>
                 <w:szCs w:val="24"/>
               </w:rPr>
-              <w:t>Semester IV</w:t>
-            </w:r>
-          </w:p>
-        </w:tc>
-        <w:tc>
-          <w:tcPr>
-            <w:tcW w:w="7655" w:type="dxa"/>
-            <w:tcBorders>
-              <w:top w:val="single" w:sz="4" w:space="0" w:color="auto"/>
-              <w:left w:val="single" w:sz="4" w:space="0" w:color="auto"/>
-              <w:bottom w:val="single" w:sz="4" w:space="0" w:color="auto"/>
-              <w:right w:val="single" w:sz="4" w:space="0" w:color="auto"/>
-            </w:tcBorders>
-            <w:tcMar>
-              <w:top w:w="0" w:type="dxa"/>
-              <w:left w:w="108" w:type="dxa"/>
-              <w:bottom w:w="0" w:type="dxa"/>
-              <w:right w:w="108" w:type="dxa"/>
-            </w:tcMar>
-            <w:hideMark/>
-          </w:tcPr>
-          <w:p>
-            <w:pPr>
-              <w:widowControl/>
-              <w:rPr>
-                <w:rFonts w:ascii="Times New Roman" w:hAnsi="Times New Roman" w:eastAsia="Times New Roman" w:cs="Times New Roman"/>
-                <w:sz w:val="24"/>
-                <w:szCs w:val="24"/>
-              </w:rPr>
-            </w:pPr>
-            <w:r>
-              <w:rPr>
-                <w:rFonts w:ascii="Times New Roman" w:hAnsi="Times New Roman" w:eastAsia="Times New Roman" w:cs="Times New Roman"/>
-                <w:sz w:val="24"/>
-                <w:szCs w:val="24"/>
-              </w:rPr>
-              <w:t>Biaya di Semester IV.</w:t>
-            </w:r>
+              <w:t xml:space="preserve">Semester </w:t>
+            </w:r>
+            <w:r>
+              <w:rPr>
+                <w:rFonts w:ascii="Times New Roman" w:eastAsia="Times New Roman" w:hAnsi="Times New Roman" w:cs="Times New Roman"/>
+                <w:b/>
+                <w:bCs/>
+                <w:sz w:val="24"/>
+                <w:szCs w:val="24"/>
+              </w:rPr>
+              <w:t>IV</w:t>
+            </w:r>
+          </w:p>
+        </w:tc>
+        <w:tc>
+          <w:tcPr>
+            <w:tcW w:w="8222" w:type="dxa"/>
+            <w:tcBorders>
+              <w:top w:val="single" w:sz="4" w:space="0" w:color="auto"/>
+              <w:left w:val="single" w:sz="4" w:space="0" w:color="auto"/>
+              <w:bottom w:val="single" w:sz="4" w:space="0" w:color="auto"/>
+              <w:right w:val="single" w:sz="4" w:space="0" w:color="auto"/>
+            </w:tcBorders>
+            <w:tcMar>
+              <w:top w:w="0" w:type="dxa"/>
+              <w:left w:w="108" w:type="dxa"/>
+              <w:bottom w:w="0" w:type="dxa"/>
+              <w:right w:w="108" w:type="dxa"/>
+            </w:tcMar>
+          </w:tcPr>
+          <w:p>
+            <w:pPr>
+              <w:widowControl/>
+              <w:rPr>
+                <w:rFonts w:ascii="Times New Roman" w:eastAsia="Times New Roman" w:hAnsi="Times New Roman" w:cs="Times New Roman"/>
+                <w:sz w:val="24"/>
+                <w:szCs w:val="24"/>
+              </w:rPr>
+            </w:pPr>
           </w:p>
         </w:tc>
         <w:tc>
@@ -854,14 +845,14 @@
               <w:widowControl/>
               <w:jc w:val="center"/>
               <w:rPr>
-                <w:rFonts w:ascii="Times New Roman" w:hAnsi="Times New Roman" w:eastAsia="Times New Roman" w:cs="Times New Roman"/>
-                <w:sz w:val="24"/>
-                <w:szCs w:val="24"/>
-              </w:rPr>
-            </w:pPr>
-            <w:r>
-              <w:rPr>
-                <w:rFonts w:ascii="Times New Roman" w:hAnsi="Times New Roman" w:eastAsia="Times New Roman" w:cs="Times New Roman"/>
+                <w:rFonts w:ascii="Times New Roman" w:eastAsia="Times New Roman" w:hAnsi="Times New Roman" w:cs="Times New Roman"/>
+                <w:sz w:val="24"/>
+                <w:szCs w:val="24"/>
+              </w:rPr>
+            </w:pPr>
+            <w:r>
+              <w:rPr>
+                <w:rFonts w:ascii="Times New Roman" w:eastAsia="Times New Roman" w:hAnsi="Times New Roman" w:cs="Times New Roman"/>
                 <w:sz w:val="24"/>
                 <w:szCs w:val="24"/>
               </w:rPr>
@@ -876,33 +867,34 @@
         </w:trPr>
         <w:tc>
           <w:tcPr>
-            <w:tcW w:w="2518" w:type="dxa"/>
-            <w:tcBorders>
-              <w:top w:val="single" w:sz="4" w:space="0" w:color="auto"/>
-              <w:left w:val="single" w:sz="4" w:space="0" w:color="auto"/>
-              <w:bottom w:val="single" w:sz="4" w:space="0" w:color="auto"/>
-              <w:right w:val="single" w:sz="4" w:space="0" w:color="auto"/>
-            </w:tcBorders>
-            <w:tcMar>
-              <w:top w:w="0" w:type="dxa"/>
-              <w:left w:w="108" w:type="dxa"/>
-              <w:bottom w:w="0" w:type="dxa"/>
-              <w:right w:w="108" w:type="dxa"/>
-            </w:tcMar>
-            <w:hideMark/>
-          </w:tcPr>
-          <w:p>
-            <w:pPr>
-              <w:widowControl/>
-              <w:rPr>
-                <w:rFonts w:ascii="Times New Roman" w:hAnsi="Times New Roman" w:eastAsia="Times New Roman" w:cs="Times New Roman"/>
-                <w:sz w:val="24"/>
-                <w:szCs w:val="24"/>
-              </w:rPr>
-            </w:pPr>
-            <w:r>
-              <w:rPr>
-                <w:rFonts w:ascii="Times New Roman" w:hAnsi="Times New Roman" w:eastAsia="Times New Roman" w:cs="Times New Roman"/>
+            <w:tcW w:w="1951" w:type="dxa"/>
+            <w:tcBorders>
+              <w:top w:val="single" w:sz="4" w:space="0" w:color="auto"/>
+              <w:left w:val="single" w:sz="4" w:space="0" w:color="auto"/>
+              <w:bottom w:val="single" w:sz="4" w:space="0" w:color="auto"/>
+              <w:right w:val="single" w:sz="4" w:space="0" w:color="auto"/>
+            </w:tcBorders>
+            <w:tcMar>
+              <w:top w:w="0" w:type="dxa"/>
+              <w:left w:w="108" w:type="dxa"/>
+              <w:bottom w:w="0" w:type="dxa"/>
+              <w:right w:w="108" w:type="dxa"/>
+            </w:tcMar>
+            <w:vAlign w:val="center"/>
+            <w:hideMark/>
+          </w:tcPr>
+          <w:p>
+            <w:pPr>
+              <w:widowControl/>
+              <w:rPr>
+                <w:rFonts w:ascii="Times New Roman" w:eastAsia="Times New Roman" w:hAnsi="Times New Roman" w:cs="Times New Roman"/>
+                <w:sz w:val="24"/>
+                <w:szCs w:val="24"/>
+              </w:rPr>
+            </w:pPr>
+            <w:r>
+              <w:rPr>
+                <w:rFonts w:ascii="Times New Roman" w:eastAsia="Times New Roman" w:hAnsi="Times New Roman" w:cs="Times New Roman"/>
                 <w:b/>
                 <w:bCs/>
                 <w:sz w:val="24"/>
@@ -914,38 +906,29 @@
         </w:tc>
         <w:tc>
           <w:tcPr>
-            <w:tcW w:w="7655" w:type="dxa"/>
-            <w:tcBorders>
-              <w:top w:val="single" w:sz="4" w:space="0" w:color="auto"/>
-              <w:left w:val="single" w:sz="4" w:space="0" w:color="auto"/>
-              <w:bottom w:val="single" w:sz="4" w:space="0" w:color="auto"/>
-              <w:right w:val="single" w:sz="4" w:space="0" w:color="auto"/>
-            </w:tcBorders>
-            <w:tcMar>
-              <w:top w:w="0" w:type="dxa"/>
-              <w:left w:w="108" w:type="dxa"/>
-              <w:bottom w:w="0" w:type="dxa"/>
-              <w:right w:w="108" w:type="dxa"/>
-            </w:tcMar>
-            <w:hideMark/>
-          </w:tcPr>
-          <w:p>
-            <w:pPr>
-              <w:widowControl/>
-              <w:rPr>
-                <w:rFonts w:ascii="Times New Roman" w:hAnsi="Times New Roman" w:eastAsia="Times New Roman" w:cs="Times New Roman"/>
-                <w:sz w:val="24"/>
-                <w:szCs w:val="24"/>
-              </w:rPr>
-            </w:pPr>
-            <w:r>
-              <w:rPr>
-                <w:rFonts w:ascii="Times New Roman" w:hAnsi="Times New Roman" w:eastAsia="Times New Roman" w:cs="Times New Roman"/>
-                <w:sz w:val="24"/>
-                <w:szCs w:val="24"/>
-              </w:rPr>
-              <w:t>Biaya di Semester V.</w:t>
-            </w:r>
+            <w:tcW w:w="8222" w:type="dxa"/>
+            <w:tcBorders>
+              <w:top w:val="single" w:sz="4" w:space="0" w:color="auto"/>
+              <w:left w:val="single" w:sz="4" w:space="0" w:color="auto"/>
+              <w:bottom w:val="single" w:sz="4" w:space="0" w:color="auto"/>
+              <w:right w:val="single" w:sz="4" w:space="0" w:color="auto"/>
+            </w:tcBorders>
+            <w:tcMar>
+              <w:top w:w="0" w:type="dxa"/>
+              <w:left w:w="108" w:type="dxa"/>
+              <w:bottom w:w="0" w:type="dxa"/>
+              <w:right w:w="108" w:type="dxa"/>
+            </w:tcMar>
+          </w:tcPr>
+          <w:p>
+            <w:pPr>
+              <w:widowControl/>
+              <w:rPr>
+                <w:rFonts w:ascii="Times New Roman" w:eastAsia="Times New Roman" w:hAnsi="Times New Roman" w:cs="Times New Roman"/>
+                <w:sz w:val="24"/>
+                <w:szCs w:val="24"/>
+              </w:rPr>
+            </w:pPr>
           </w:p>
         </w:tc>
         <w:tc>
@@ -971,14 +954,14 @@
               <w:widowControl/>
               <w:jc w:val="center"/>
               <w:rPr>
-                <w:rFonts w:ascii="Times New Roman" w:hAnsi="Times New Roman" w:eastAsia="Times New Roman" w:cs="Times New Roman"/>
-                <w:sz w:val="24"/>
-                <w:szCs w:val="24"/>
-              </w:rPr>
-            </w:pPr>
-            <w:r>
-              <w:rPr>
-                <w:rFonts w:ascii="Times New Roman" w:hAnsi="Times New Roman" w:eastAsia="Times New Roman" w:cs="Times New Roman"/>
+                <w:rFonts w:ascii="Times New Roman" w:eastAsia="Times New Roman" w:hAnsi="Times New Roman" w:cs="Times New Roman"/>
+                <w:sz w:val="24"/>
+                <w:szCs w:val="24"/>
+              </w:rPr>
+            </w:pPr>
+            <w:r>
+              <w:rPr>
+                <w:rFonts w:ascii="Times New Roman" w:eastAsia="Times New Roman" w:hAnsi="Times New Roman" w:cs="Times New Roman"/>
                 <w:sz w:val="24"/>
                 <w:szCs w:val="24"/>
               </w:rPr>
@@ -993,33 +976,34 @@
         </w:trPr>
         <w:tc>
           <w:tcPr>
-            <w:tcW w:w="2518" w:type="dxa"/>
-            <w:tcBorders>
-              <w:top w:val="single" w:sz="4" w:space="0" w:color="auto"/>
-              <w:left w:val="single" w:sz="4" w:space="0" w:color="auto"/>
-              <w:bottom w:val="single" w:sz="4" w:space="0" w:color="auto"/>
-              <w:right w:val="single" w:sz="4" w:space="0" w:color="auto"/>
-            </w:tcBorders>
-            <w:tcMar>
-              <w:top w:w="0" w:type="dxa"/>
-              <w:left w:w="108" w:type="dxa"/>
-              <w:bottom w:w="0" w:type="dxa"/>
-              <w:right w:w="108" w:type="dxa"/>
-            </w:tcMar>
-            <w:hideMark/>
-          </w:tcPr>
-          <w:p>
-            <w:pPr>
-              <w:widowControl/>
-              <w:rPr>
-                <w:rFonts w:ascii="Times New Roman" w:hAnsi="Times New Roman" w:eastAsia="Times New Roman" w:cs="Times New Roman"/>
-                <w:sz w:val="24"/>
-                <w:szCs w:val="24"/>
-              </w:rPr>
-            </w:pPr>
-            <w:r>
-              <w:rPr>
-                <w:rFonts w:ascii="Times New Roman" w:hAnsi="Times New Roman" w:eastAsia="Times New Roman" w:cs="Times New Roman"/>
+            <w:tcW w:w="1951" w:type="dxa"/>
+            <w:tcBorders>
+              <w:top w:val="single" w:sz="4" w:space="0" w:color="auto"/>
+              <w:left w:val="single" w:sz="4" w:space="0" w:color="auto"/>
+              <w:bottom w:val="single" w:sz="4" w:space="0" w:color="auto"/>
+              <w:right w:val="single" w:sz="4" w:space="0" w:color="auto"/>
+            </w:tcBorders>
+            <w:tcMar>
+              <w:top w:w="0" w:type="dxa"/>
+              <w:left w:w="108" w:type="dxa"/>
+              <w:bottom w:w="0" w:type="dxa"/>
+              <w:right w:w="108" w:type="dxa"/>
+            </w:tcMar>
+            <w:vAlign w:val="center"/>
+            <w:hideMark/>
+          </w:tcPr>
+          <w:p>
+            <w:pPr>
+              <w:widowControl/>
+              <w:rPr>
+                <w:rFonts w:ascii="Times New Roman" w:eastAsia="Times New Roman" w:hAnsi="Times New Roman" w:cs="Times New Roman"/>
+                <w:sz w:val="24"/>
+                <w:szCs w:val="24"/>
+              </w:rPr>
+            </w:pPr>
+            <w:r>
+              <w:rPr>
+                <w:rFonts w:ascii="Times New Roman" w:eastAsia="Times New Roman" w:hAnsi="Times New Roman" w:cs="Times New Roman"/>
                 <w:b/>
                 <w:bCs/>
                 <w:sz w:val="24"/>
@@ -1031,38 +1015,29 @@
         </w:tc>
         <w:tc>
           <w:tcPr>
-            <w:tcW w:w="7655" w:type="dxa"/>
-            <w:tcBorders>
-              <w:top w:val="single" w:sz="4" w:space="0" w:color="auto"/>
-              <w:left w:val="single" w:sz="4" w:space="0" w:color="auto"/>
-              <w:bottom w:val="single" w:sz="4" w:space="0" w:color="auto"/>
-              <w:right w:val="single" w:sz="4" w:space="0" w:color="auto"/>
-            </w:tcBorders>
-            <w:tcMar>
-              <w:top w:w="0" w:type="dxa"/>
-              <w:left w:w="108" w:type="dxa"/>
-              <w:bottom w:w="0" w:type="dxa"/>
-              <w:right w:w="108" w:type="dxa"/>
-            </w:tcMar>
-            <w:hideMark/>
-          </w:tcPr>
-          <w:p>
-            <w:pPr>
-              <w:widowControl/>
-              <w:rPr>
-                <w:rFonts w:ascii="Times New Roman" w:hAnsi="Times New Roman" w:eastAsia="Times New Roman" w:cs="Times New Roman"/>
-                <w:sz w:val="24"/>
-                <w:szCs w:val="24"/>
-              </w:rPr>
-            </w:pPr>
-            <w:r>
-              <w:rPr>
-                <w:rFonts w:ascii="Times New Roman" w:hAnsi="Times New Roman" w:eastAsia="Times New Roman" w:cs="Times New Roman"/>
-                <w:sz w:val="24"/>
-                <w:szCs w:val="24"/>
-              </w:rPr>
-              <w:t>Biaya di Semester VI.</w:t>
-            </w:r>
+            <w:tcW w:w="8222" w:type="dxa"/>
+            <w:tcBorders>
+              <w:top w:val="single" w:sz="4" w:space="0" w:color="auto"/>
+              <w:left w:val="single" w:sz="4" w:space="0" w:color="auto"/>
+              <w:bottom w:val="single" w:sz="4" w:space="0" w:color="auto"/>
+              <w:right w:val="single" w:sz="4" w:space="0" w:color="auto"/>
+            </w:tcBorders>
+            <w:tcMar>
+              <w:top w:w="0" w:type="dxa"/>
+              <w:left w:w="108" w:type="dxa"/>
+              <w:bottom w:w="0" w:type="dxa"/>
+              <w:right w:w="108" w:type="dxa"/>
+            </w:tcMar>
+          </w:tcPr>
+          <w:p>
+            <w:pPr>
+              <w:widowControl/>
+              <w:rPr>
+                <w:rFonts w:ascii="Times New Roman" w:eastAsia="Times New Roman" w:hAnsi="Times New Roman" w:cs="Times New Roman"/>
+                <w:sz w:val="24"/>
+                <w:szCs w:val="24"/>
+              </w:rPr>
+            </w:pPr>
           </w:p>
         </w:tc>
         <w:tc>
@@ -1088,14 +1063,14 @@
               <w:widowControl/>
               <w:jc w:val="center"/>
               <w:rPr>
-                <w:rFonts w:ascii="Times New Roman" w:hAnsi="Times New Roman" w:eastAsia="Times New Roman" w:cs="Times New Roman"/>
-                <w:sz w:val="24"/>
-                <w:szCs w:val="24"/>
-              </w:rPr>
-            </w:pPr>
-            <w:r>
-              <w:rPr>
-                <w:rFonts w:ascii="Times New Roman" w:hAnsi="Times New Roman" w:eastAsia="Times New Roman" w:cs="Times New Roman"/>
+                <w:rFonts w:ascii="Times New Roman" w:eastAsia="Times New Roman" w:hAnsi="Times New Roman" w:cs="Times New Roman"/>
+                <w:sz w:val="24"/>
+                <w:szCs w:val="24"/>
+              </w:rPr>
+            </w:pPr>
+            <w:r>
+              <w:rPr>
+                <w:rFonts w:ascii="Times New Roman" w:eastAsia="Times New Roman" w:hAnsi="Times New Roman" w:cs="Times New Roman"/>
                 <w:sz w:val="24"/>
                 <w:szCs w:val="24"/>
               </w:rPr>
@@ -1110,33 +1085,34 @@
         </w:trPr>
         <w:tc>
           <w:tcPr>
-            <w:tcW w:w="2518" w:type="dxa"/>
-            <w:tcBorders>
-              <w:top w:val="single" w:sz="4" w:space="0" w:color="auto"/>
-              <w:left w:val="single" w:sz="4" w:space="0" w:color="auto"/>
-              <w:bottom w:val="single" w:sz="4" w:space="0" w:color="auto"/>
-              <w:right w:val="single" w:sz="4" w:space="0" w:color="auto"/>
-            </w:tcBorders>
-            <w:tcMar>
-              <w:top w:w="0" w:type="dxa"/>
-              <w:left w:w="108" w:type="dxa"/>
-              <w:bottom w:w="0" w:type="dxa"/>
-              <w:right w:w="108" w:type="dxa"/>
-            </w:tcMar>
-            <w:hideMark/>
-          </w:tcPr>
-          <w:p>
-            <w:pPr>
-              <w:widowControl/>
-              <w:rPr>
-                <w:rFonts w:ascii="Times New Roman" w:hAnsi="Times New Roman" w:eastAsia="Times New Roman" w:cs="Times New Roman"/>
-                <w:sz w:val="24"/>
-                <w:szCs w:val="24"/>
-              </w:rPr>
-            </w:pPr>
-            <w:r>
-              <w:rPr>
-                <w:rFonts w:ascii="Times New Roman" w:hAnsi="Times New Roman" w:eastAsia="Times New Roman" w:cs="Times New Roman"/>
+            <w:tcW w:w="1951" w:type="dxa"/>
+            <w:tcBorders>
+              <w:top w:val="single" w:sz="4" w:space="0" w:color="auto"/>
+              <w:left w:val="single" w:sz="4" w:space="0" w:color="auto"/>
+              <w:bottom w:val="single" w:sz="4" w:space="0" w:color="auto"/>
+              <w:right w:val="single" w:sz="4" w:space="0" w:color="auto"/>
+            </w:tcBorders>
+            <w:tcMar>
+              <w:top w:w="0" w:type="dxa"/>
+              <w:left w:w="108" w:type="dxa"/>
+              <w:bottom w:w="0" w:type="dxa"/>
+              <w:right w:w="108" w:type="dxa"/>
+            </w:tcMar>
+            <w:vAlign w:val="center"/>
+            <w:hideMark/>
+          </w:tcPr>
+          <w:p>
+            <w:pPr>
+              <w:widowControl/>
+              <w:rPr>
+                <w:rFonts w:ascii="Times New Roman" w:eastAsia="Times New Roman" w:hAnsi="Times New Roman" w:cs="Times New Roman"/>
+                <w:sz w:val="24"/>
+                <w:szCs w:val="24"/>
+              </w:rPr>
+            </w:pPr>
+            <w:r>
+              <w:rPr>
+                <w:rFonts w:ascii="Times New Roman" w:eastAsia="Times New Roman" w:hAnsi="Times New Roman" w:cs="Times New Roman"/>
                 <w:b/>
                 <w:bCs/>
                 <w:sz w:val="24"/>
@@ -1148,33 +1124,33 @@
         </w:tc>
         <w:tc>
           <w:tcPr>
-            <w:tcW w:w="7655" w:type="dxa"/>
-            <w:tcBorders>
-              <w:top w:val="single" w:sz="4" w:space="0" w:color="auto"/>
-              <w:left w:val="single" w:sz="4" w:space="0" w:color="auto"/>
-              <w:bottom w:val="single" w:sz="4" w:space="0" w:color="auto"/>
-              <w:right w:val="single" w:sz="4" w:space="0" w:color="auto"/>
-            </w:tcBorders>
-            <w:tcMar>
-              <w:top w:w="0" w:type="dxa"/>
-              <w:left w:w="108" w:type="dxa"/>
-              <w:bottom w:w="0" w:type="dxa"/>
-              <w:right w:w="108" w:type="dxa"/>
-            </w:tcMar>
-            <w:hideMark/>
-          </w:tcPr>
-          <w:p>
-            <w:pPr>
-              <w:widowControl/>
-              <w:rPr>
-                <w:rFonts w:ascii="Times New Roman" w:hAnsi="Times New Roman" w:eastAsia="Times New Roman" w:cs="Times New Roman"/>
-                <w:sz w:val="24"/>
-                <w:szCs w:val="24"/>
-              </w:rPr>
-            </w:pPr>
-            <w:r>
-              <w:rPr>
-                <w:rFonts w:ascii="Times New Roman" w:hAnsi="Times New Roman" w:eastAsia="Times New Roman" w:cs="Times New Roman"/>
+            <w:tcW w:w="8222" w:type="dxa"/>
+            <w:tcBorders>
+              <w:top w:val="single" w:sz="4" w:space="0" w:color="auto"/>
+              <w:left w:val="single" w:sz="4" w:space="0" w:color="auto"/>
+              <w:bottom w:val="single" w:sz="4" w:space="0" w:color="auto"/>
+              <w:right w:val="single" w:sz="4" w:space="0" w:color="auto"/>
+            </w:tcBorders>
+            <w:tcMar>
+              <w:top w:w="0" w:type="dxa"/>
+              <w:left w:w="108" w:type="dxa"/>
+              <w:bottom w:w="0" w:type="dxa"/>
+              <w:right w:w="108" w:type="dxa"/>
+            </w:tcMar>
+            <w:hideMark/>
+          </w:tcPr>
+          <w:p>
+            <w:pPr>
+              <w:widowControl/>
+              <w:rPr>
+                <w:rFonts w:ascii="Times New Roman" w:eastAsia="Times New Roman" w:hAnsi="Times New Roman" w:cs="Times New Roman"/>
+                <w:sz w:val="24"/>
+                <w:szCs w:val="24"/>
+              </w:rPr>
+            </w:pPr>
+            <w:r>
+              <w:rPr>
+                <w:rFonts w:ascii="Times New Roman" w:eastAsia="Times New Roman" w:hAnsi="Times New Roman" w:cs="Times New Roman"/>
                 <w:sz w:val="24"/>
                 <w:szCs w:val="24"/>
               </w:rPr>
@@ -1205,14 +1181,14 @@
               <w:widowControl/>
               <w:jc w:val="center"/>
               <w:rPr>
-                <w:rFonts w:ascii="Times New Roman" w:hAnsi="Times New Roman" w:eastAsia="Times New Roman" w:cs="Times New Roman"/>
-                <w:sz w:val="24"/>
-                <w:szCs w:val="24"/>
-              </w:rPr>
-            </w:pPr>
-            <w:r>
-              <w:rPr>
-                <w:rFonts w:ascii="Times New Roman" w:hAnsi="Times New Roman" w:eastAsia="Times New Roman" w:cs="Times New Roman"/>
+                <w:rFonts w:ascii="Times New Roman" w:eastAsia="Times New Roman" w:hAnsi="Times New Roman" w:cs="Times New Roman"/>
+                <w:sz w:val="24"/>
+                <w:szCs w:val="24"/>
+              </w:rPr>
+            </w:pPr>
+            <w:r>
+              <w:rPr>
+                <w:rFonts w:ascii="Times New Roman" w:eastAsia="Times New Roman" w:hAnsi="Times New Roman" w:cs="Times New Roman"/>
                 <w:sz w:val="24"/>
                 <w:szCs w:val="24"/>
               </w:rPr>
@@ -1227,33 +1203,34 @@
         </w:trPr>
         <w:tc>
           <w:tcPr>
-            <w:tcW w:w="2518" w:type="dxa"/>
-            <w:tcBorders>
-              <w:top w:val="single" w:sz="4" w:space="0" w:color="auto"/>
-              <w:left w:val="single" w:sz="4" w:space="0" w:color="auto"/>
-              <w:bottom w:val="single" w:sz="4" w:space="0" w:color="auto"/>
-              <w:right w:val="single" w:sz="4" w:space="0" w:color="auto"/>
-            </w:tcBorders>
-            <w:tcMar>
-              <w:top w:w="0" w:type="dxa"/>
-              <w:left w:w="108" w:type="dxa"/>
-              <w:bottom w:w="0" w:type="dxa"/>
-              <w:right w:w="108" w:type="dxa"/>
-            </w:tcMar>
-            <w:hideMark/>
-          </w:tcPr>
-          <w:p>
-            <w:pPr>
-              <w:widowControl/>
-              <w:rPr>
-                <w:rFonts w:ascii="Times New Roman" w:hAnsi="Times New Roman" w:eastAsia="Times New Roman" w:cs="Times New Roman"/>
-                <w:sz w:val="24"/>
-                <w:szCs w:val="24"/>
-              </w:rPr>
-            </w:pPr>
-            <w:r>
-              <w:rPr>
-                <w:rFonts w:ascii="Times New Roman" w:hAnsi="Times New Roman" w:eastAsia="Times New Roman" w:cs="Times New Roman"/>
+            <w:tcW w:w="1951" w:type="dxa"/>
+            <w:tcBorders>
+              <w:top w:val="single" w:sz="4" w:space="0" w:color="auto"/>
+              <w:left w:val="single" w:sz="4" w:space="0" w:color="auto"/>
+              <w:bottom w:val="single" w:sz="4" w:space="0" w:color="auto"/>
+              <w:right w:val="single" w:sz="4" w:space="0" w:color="auto"/>
+            </w:tcBorders>
+            <w:tcMar>
+              <w:top w:w="0" w:type="dxa"/>
+              <w:left w:w="108" w:type="dxa"/>
+              <w:bottom w:w="0" w:type="dxa"/>
+              <w:right w:w="108" w:type="dxa"/>
+            </w:tcMar>
+            <w:vAlign w:val="center"/>
+            <w:hideMark/>
+          </w:tcPr>
+          <w:p>
+            <w:pPr>
+              <w:widowControl/>
+              <w:rPr>
+                <w:rFonts w:ascii="Times New Roman" w:eastAsia="Times New Roman" w:hAnsi="Times New Roman" w:cs="Times New Roman"/>
+                <w:sz w:val="24"/>
+                <w:szCs w:val="24"/>
+              </w:rPr>
+            </w:pPr>
+            <w:r>
+              <w:rPr>
+                <w:rFonts w:ascii="Times New Roman" w:eastAsia="Times New Roman" w:hAnsi="Times New Roman" w:cs="Times New Roman"/>
                 <w:b/>
                 <w:bCs/>
                 <w:sz w:val="24"/>
@@ -1265,37 +1242,45 @@
         </w:tc>
         <w:tc>
           <w:tcPr>
-            <w:tcW w:w="7655" w:type="dxa"/>
-            <w:tcBorders>
-              <w:top w:val="single" w:sz="4" w:space="0" w:color="auto"/>
-              <w:left w:val="single" w:sz="4" w:space="0" w:color="auto"/>
-              <w:bottom w:val="single" w:sz="4" w:space="0" w:color="auto"/>
-              <w:right w:val="single" w:sz="4" w:space="0" w:color="auto"/>
-            </w:tcBorders>
-            <w:tcMar>
-              <w:top w:w="0" w:type="dxa"/>
-              <w:left w:w="108" w:type="dxa"/>
-              <w:bottom w:w="0" w:type="dxa"/>
-              <w:right w:w="108" w:type="dxa"/>
-            </w:tcMar>
-            <w:hideMark/>
-          </w:tcPr>
-          <w:p>
-            <w:pPr>
-              <w:widowControl/>
-              <w:rPr>
-                <w:rFonts w:ascii="Times New Roman" w:hAnsi="Times New Roman" w:eastAsia="Times New Roman" w:cs="Times New Roman"/>
-                <w:sz w:val="24"/>
-                <w:szCs w:val="24"/>
-              </w:rPr>
-            </w:pPr>
-            <w:r>
-              <w:rPr>
-                <w:rFonts w:ascii="Times New Roman" w:hAnsi="Times New Roman" w:eastAsia="Times New Roman" w:cs="Times New Roman"/>
-                <w:sz w:val="24"/>
-                <w:szCs w:val="24"/>
-              </w:rPr>
-              <w:t>Termasuk tambahan untuk biaya Sidang TA &amp; Wisuda (3.000.000).</w:t>
+            <w:tcW w:w="8222" w:type="dxa"/>
+            <w:tcBorders>
+              <w:top w:val="single" w:sz="4" w:space="0" w:color="auto"/>
+              <w:left w:val="single" w:sz="4" w:space="0" w:color="auto"/>
+              <w:bottom w:val="single" w:sz="4" w:space="0" w:color="auto"/>
+              <w:right w:val="single" w:sz="4" w:space="0" w:color="auto"/>
+            </w:tcBorders>
+            <w:tcMar>
+              <w:top w:w="0" w:type="dxa"/>
+              <w:left w:w="108" w:type="dxa"/>
+              <w:bottom w:w="0" w:type="dxa"/>
+              <w:right w:w="108" w:type="dxa"/>
+            </w:tcMar>
+            <w:hideMark/>
+          </w:tcPr>
+          <w:p>
+            <w:pPr>
+              <w:widowControl/>
+              <w:rPr>
+                <w:rFonts w:ascii="Times New Roman" w:eastAsia="Times New Roman" w:hAnsi="Times New Roman" w:cs="Times New Roman"/>
+                <w:sz w:val="24"/>
+                <w:szCs w:val="24"/>
+              </w:rPr>
+            </w:pPr>
+            <w:r>
+              <w:rPr>
+                <w:rFonts w:ascii="Times New Roman" w:eastAsia="Times New Roman" w:hAnsi="Times New Roman" w:cs="Times New Roman"/>
+                <w:sz w:val="24"/>
+                <w:szCs w:val="24"/>
+              </w:rPr>
+              <w:t xml:space="preserve">Termasuk tambahan untuk biaya Sidang TA &amp; </w:t>
+            </w:r>
+            <w:r>
+              <w:rPr>
+                <w:rFonts w:ascii="Times New Roman" w:eastAsia="Times New Roman" w:hAnsi="Times New Roman" w:cs="Times New Roman"/>
+                <w:sz w:val="24"/>
+                <w:szCs w:val="24"/>
+              </w:rPr>
+              <w:t>Wisuda (3.000.000).</w:t>
             </w:r>
           </w:p>
         </w:tc>
@@ -1322,14 +1307,14 @@
               <w:widowControl/>
               <w:jc w:val="center"/>
               <w:rPr>
-                <w:rFonts w:ascii="Times New Roman" w:hAnsi="Times New Roman" w:eastAsia="Times New Roman" w:cs="Times New Roman"/>
-                <w:sz w:val="24"/>
-                <w:szCs w:val="24"/>
-              </w:rPr>
-            </w:pPr>
-            <w:r>
-              <w:rPr>
-                <w:rFonts w:ascii="Times New Roman" w:hAnsi="Times New Roman" w:eastAsia="Times New Roman" w:cs="Times New Roman"/>
+                <w:rFonts w:ascii="Times New Roman" w:eastAsia="Times New Roman" w:hAnsi="Times New Roman" w:cs="Times New Roman"/>
+                <w:sz w:val="24"/>
+                <w:szCs w:val="24"/>
+              </w:rPr>
+            </w:pPr>
+            <w:r>
+              <w:rPr>
+                <w:rFonts w:ascii="Times New Roman" w:eastAsia="Times New Roman" w:hAnsi="Times New Roman" w:cs="Times New Roman"/>
                 <w:sz w:val="24"/>
                 <w:szCs w:val="24"/>
               </w:rPr>
@@ -1344,33 +1329,36 @@
         </w:trPr>
         <w:tc>
           <w:tcPr>
-            <w:tcW w:w="2518" w:type="dxa"/>
-            <w:tcBorders>
-              <w:top w:val="single" w:sz="4" w:space="0" w:color="auto"/>
-              <w:left w:val="single" w:sz="4" w:space="0" w:color="auto"/>
-              <w:bottom w:val="single" w:sz="4" w:space="0" w:color="auto"/>
-              <w:right w:val="single" w:sz="4" w:space="0" w:color="auto"/>
-            </w:tcBorders>
-            <w:tcMar>
-              <w:top w:w="0" w:type="dxa"/>
-              <w:left w:w="108" w:type="dxa"/>
-              <w:bottom w:w="0" w:type="dxa"/>
-              <w:right w:w="108" w:type="dxa"/>
-            </w:tcMar>
-            <w:hideMark/>
-          </w:tcPr>
-          <w:p>
-            <w:pPr>
-              <w:widowControl/>
-              <w:rPr>
-                <w:rFonts w:ascii="Times New Roman" w:hAnsi="Times New Roman" w:eastAsia="Times New Roman" w:cs="Times New Roman"/>
-                <w:sz w:val="24"/>
-                <w:szCs w:val="24"/>
-              </w:rPr>
-            </w:pPr>
-            <w:r>
-              <w:rPr>
-                <w:rFonts w:ascii="Times New Roman" w:hAnsi="Times New Roman" w:eastAsia="Times New Roman" w:cs="Times New Roman"/>
+            <w:tcW w:w="10173" w:type="dxa"/>
+            <w:gridSpan w:val="2"/>
+            <w:tcBorders>
+              <w:top w:val="single" w:sz="4" w:space="0" w:color="auto"/>
+              <w:left w:val="single" w:sz="4" w:space="0" w:color="auto"/>
+              <w:bottom w:val="single" w:sz="4" w:space="0" w:color="auto"/>
+              <w:right w:val="single" w:sz="4" w:space="0" w:color="auto"/>
+            </w:tcBorders>
+            <w:tcMar>
+              <w:top w:w="0" w:type="dxa"/>
+              <w:left w:w="108" w:type="dxa"/>
+              <w:bottom w:w="0" w:type="dxa"/>
+              <w:right w:w="108" w:type="dxa"/>
+            </w:tcMar>
+            <w:vAlign w:val="center"/>
+            <w:hideMark/>
+          </w:tcPr>
+          <w:p>
+            <w:pPr>
+              <w:widowControl/>
+              <w:jc w:val="center"/>
+              <w:rPr>
+                <w:rFonts w:ascii="Times New Roman" w:eastAsia="Times New Roman" w:hAnsi="Times New Roman" w:cs="Times New Roman"/>
+                <w:sz w:val="24"/>
+                <w:szCs w:val="24"/>
+              </w:rPr>
+            </w:pPr>
+            <w:r>
+              <w:rPr>
+                <w:rFonts w:ascii="Times New Roman" w:eastAsia="Times New Roman" w:hAnsi="Times New Roman" w:cs="Times New Roman"/>
                 <w:b/>
                 <w:bCs/>
                 <w:sz w:val="24"/>
@@ -1382,42 +1370,6 @@
         </w:tc>
         <w:tc>
           <w:tcPr>
-            <w:tcW w:w="7655" w:type="dxa"/>
-            <w:tcBorders>
-              <w:top w:val="single" w:sz="4" w:space="0" w:color="auto"/>
-              <w:left w:val="single" w:sz="4" w:space="0" w:color="auto"/>
-              <w:bottom w:val="single" w:sz="4" w:space="0" w:color="auto"/>
-              <w:right w:val="single" w:sz="4" w:space="0" w:color="auto"/>
-            </w:tcBorders>
-            <w:tcMar>
-              <w:top w:w="0" w:type="dxa"/>
-              <w:left w:w="108" w:type="dxa"/>
-              <w:bottom w:w="0" w:type="dxa"/>
-              <w:right w:w="108" w:type="dxa"/>
-            </w:tcMar>
-            <w:hideMark/>
-          </w:tcPr>
-          <w:p>
-            <w:pPr>
-              <w:widowControl/>
-              <w:rPr>
-                <w:rFonts w:ascii="Times New Roman" w:hAnsi="Times New Roman" w:eastAsia="Times New Roman" w:cs="Times New Roman"/>
-                <w:sz w:val="24"/>
-                <w:szCs w:val="24"/>
-              </w:rPr>
-            </w:pPr>
-            <w:r>
-              <w:rPr>
-                <w:rFonts w:ascii="Times New Roman" w:hAnsi="Times New Roman" w:eastAsia="Times New Roman" w:cs="Times New Roman"/>
-                <w:sz w:val="24"/>
-                <w:szCs w:val="24"/>
-              </w:rPr>
-              <w:t>Akumulasi total keseluruhan biaya.</w:t>
-            </w:r>
-          </w:p>
-        </w:tc>
-        <w:tc>
-          <w:tcPr>
             <w:tcW w:w="1818" w:type="dxa"/>
             <w:tcBorders>
               <w:top w:val="single" w:sz="4" w:space="0" w:color="auto"/>
@@ -1439,14 +1391,14 @@
               <w:widowControl/>
               <w:jc w:val="center"/>
               <w:rPr>
-                <w:rFonts w:ascii="Times New Roman" w:hAnsi="Times New Roman" w:eastAsia="Times New Roman" w:cs="Times New Roman"/>
-                <w:sz w:val="24"/>
-                <w:szCs w:val="24"/>
-              </w:rPr>
-            </w:pPr>
-            <w:r>
-              <w:rPr>
-                <w:rFonts w:ascii="Times New Roman" w:hAnsi="Times New Roman" w:eastAsia="Times New Roman" w:cs="Times New Roman"/>
+                <w:rFonts w:ascii="Times New Roman" w:eastAsia="Times New Roman" w:hAnsi="Times New Roman" w:cs="Times New Roman"/>
+                <w:sz w:val="24"/>
+                <w:szCs w:val="24"/>
+              </w:rPr>
+            </w:pPr>
+            <w:r>
+              <w:rPr>
+                <w:rFonts w:ascii="Times New Roman" w:eastAsia="Times New Roman" w:hAnsi="Times New Roman" w:cs="Times New Roman"/>
                 <w:sz w:val="24"/>
                 <w:szCs w:val="24"/>
               </w:rPr>
@@ -1461,6 +1413,7 @@
       <w:type w:val="continuous"/>
       <w:pgSz w:w="15840" w:h="17280"/>
       <w:pgMar w:top="2268" w:right="1797" w:bottom="1701" w:left="2268" w:header="720" w:footer="720" w:gutter="0"/>
+      <w:cols w:space="720"/>
     </w:sectPr>
   </w:body>
 </w:document>

</xml_diff>